<commit_message>
Initial commit for Fizz Buzz Project
</commit_message>
<xml_diff>
--- a/Week 1 Calculator.docx
+++ b/Week 1 Calculator.docx
@@ -274,705 +274,565 @@
     </w:p>
     <w:p>
       <w:r>
-        <w:t>            &lt;label for</w:t>
-      </w:r>
-      <w:proofErr w:type="gramStart"/>
+        <w:t>            &lt;label for=</w:t>
+      </w:r>
+      <w:r>
+        <w:t>”</w:t>
+      </w:r>
+      <w:proofErr w:type="spellStart"/>
+      <w:r>
+        <w:t>mealCost</w:t>
+      </w:r>
+      <w:proofErr w:type="spellEnd"/>
+      <w:r>
+        <w:t>”</w:t>
+      </w:r>
+      <w:r>
+        <w:t>&gt;Meal Cost&lt;/label&gt;</w:t>
+      </w:r>
+    </w:p>
+    <w:p>
+      <w:r>
+        <w:t>            &lt;input id=</w:t>
+      </w:r>
+      <w:r>
+        <w:t>”</w:t>
+      </w:r>
+      <w:proofErr w:type="spellStart"/>
+      <w:r>
+        <w:t>mealCost</w:t>
+      </w:r>
+      <w:proofErr w:type="spellEnd"/>
+      <w:r>
+        <w:t>”</w:t>
+      </w:r>
+      <w:r>
+        <w:t xml:space="preserve"> type=</w:t>
+      </w:r>
+      <w:r>
+        <w:t>”</w:t>
+      </w:r>
+      <w:r>
+        <w:t>number</w:t>
+      </w:r>
+      <w:r>
+        <w:t>”</w:t>
+      </w:r>
+      <w:r>
+        <w:t xml:space="preserve"> min=</w:t>
+      </w:r>
+      <w:r>
+        <w:t>”</w:t>
+      </w:r>
+      <w:r>
+        <w:t>0</w:t>
+      </w:r>
+      <w:r>
+        <w:t>”</w:t>
+      </w:r>
+      <w:r>
+        <w:t xml:space="preserve"> step=</w:t>
+      </w:r>
+      <w:r>
+        <w:t>”</w:t>
+      </w:r>
+      <w:r>
+        <w:t>0.01</w:t>
+      </w:r>
+      <w:r>
+        <w:t>”</w:t>
+      </w:r>
+      <w:r>
+        <w:t xml:space="preserve"> placeholder=</w:t>
+      </w:r>
+      <w:r>
+        <w:t>”</w:t>
+      </w:r>
+      <w:r>
+        <w:t>Enter meal cost</w:t>
+      </w:r>
+      <w:r>
+        <w:t>”</w:t>
+      </w:r>
+      <w:r>
+        <w:t xml:space="preserve"> required&gt;</w:t>
+      </w:r>
+    </w:p>
+    <w:p/>
+    <w:p>
+      <w:r>
+        <w:t>            &lt;label for=</w:t>
+      </w:r>
+      <w:r>
+        <w:t>”</w:t>
+      </w:r>
+      <w:proofErr w:type="spellStart"/>
+      <w:r>
+        <w:t>tipPercent</w:t>
+      </w:r>
+      <w:proofErr w:type="spellEnd"/>
+      <w:r>
+        <w:t>”</w:t>
+      </w:r>
+      <w:r>
+        <w:t>&gt;Tip Percent&lt;/label&gt;</w:t>
+      </w:r>
+    </w:p>
+    <w:p>
+      <w:r>
+        <w:t>            &lt;input id=</w:t>
+      </w:r>
+      <w:r>
+        <w:t>”</w:t>
+      </w:r>
+      <w:proofErr w:type="spellStart"/>
+      <w:r>
+        <w:t>tipPercent</w:t>
+      </w:r>
+      <w:proofErr w:type="spellEnd"/>
+      <w:r>
+        <w:t>”</w:t>
+      </w:r>
+      <w:r>
+        <w:t xml:space="preserve"> type=</w:t>
+      </w:r>
+      <w:r>
+        <w:t>”</w:t>
+      </w:r>
+      <w:r>
+        <w:t>number</w:t>
+      </w:r>
+      <w:r>
+        <w:t>”</w:t>
+      </w:r>
+      <w:r>
+        <w:t xml:space="preserve"> min=</w:t>
+      </w:r>
+      <w:r>
+        <w:t>”</w:t>
+      </w:r>
+      <w:r>
+        <w:t>0</w:t>
+      </w:r>
+      <w:r>
+        <w:t>”</w:t>
+      </w:r>
+      <w:r>
+        <w:t xml:space="preserve"> max=</w:t>
+      </w:r>
+      <w:r>
+        <w:t>”</w:t>
+      </w:r>
+      <w:r>
+        <w:t>100</w:t>
+      </w:r>
+      <w:r>
+        <w:t>”</w:t>
+      </w:r>
+      <w:r>
+        <w:t xml:space="preserve"> step=</w:t>
+      </w:r>
+      <w:r>
+        <w:t>”</w:t>
+      </w:r>
+      <w:r>
+        <w:t>1</w:t>
+      </w:r>
+      <w:r>
+        <w:t>”</w:t>
+      </w:r>
+      <w:r>
+        <w:t xml:space="preserve"> placeholder=</w:t>
+      </w:r>
+      <w:r>
+        <w:t>”</w:t>
+      </w:r>
+      <w:r>
+        <w:t>Enter tip percent</w:t>
+      </w:r>
+      <w:r>
+        <w:t>”</w:t>
+      </w:r>
+      <w:r>
+        <w:t xml:space="preserve"> required&gt;</w:t>
+      </w:r>
+    </w:p>
+    <w:p/>
+    <w:p>
+      <w:r>
+        <w:t>            &lt;button id=</w:t>
+      </w:r>
+      <w:r>
+        <w:t>”</w:t>
+      </w:r>
+      <w:proofErr w:type="spellStart"/>
+      <w:r>
+        <w:t>calculateBtn</w:t>
+      </w:r>
+      <w:proofErr w:type="spellEnd"/>
+      <w:r>
+        <w:t>”</w:t>
+      </w:r>
+      <w:r>
+        <w:t xml:space="preserve"> type=</w:t>
+      </w:r>
+      <w:r>
+        <w:t>”</w:t>
+      </w:r>
+      <w:r>
+        <w:t>button</w:t>
+      </w:r>
+      <w:r>
+        <w:t>”</w:t>
+      </w:r>
+      <w:r>
+        <w:t>&gt;Calculate&lt;/button&gt;</w:t>
+      </w:r>
+    </w:p>
+    <w:p>
+      <w:r>
+        <w:t>        &lt;/div&gt;</w:t>
+      </w:r>
+    </w:p>
+    <w:p/>
+    <w:p>
+      <w:r>
+        <w:t>        &lt;section class=</w:t>
+      </w:r>
+      <w:r>
+        <w:t>”</w:t>
+      </w:r>
+      <w:r>
+        <w:t>results</w:t>
+      </w:r>
+      <w:r>
+        <w:t>”</w:t>
+      </w:r>
+      <w:r>
+        <w:t xml:space="preserve"> aria-live=</w:t>
+      </w:r>
+      <w:r>
+        <w:t>”</w:t>
+      </w:r>
+      <w:r>
+        <w:t>polite</w:t>
+      </w:r>
+      <w:r>
+        <w:t>”</w:t>
+      </w:r>
+      <w:r>
+        <w:t>&gt;</w:t>
+      </w:r>
+    </w:p>
+    <w:p>
+      <w:r>
+        <w:t>            &lt;div class=</w:t>
+      </w:r>
+      <w:r>
+        <w:t>”</w:t>
+      </w:r>
+      <w:r>
+        <w:t>result-row</w:t>
+      </w:r>
+      <w:r>
+        <w:t>”</w:t>
+      </w:r>
+      <w:r>
+        <w:t>&gt;</w:t>
+      </w:r>
+    </w:p>
+    <w:p>
+      <w:r>
+        <w:t>                &lt;span class=</w:t>
+      </w:r>
+      <w:r>
+        <w:t>”</w:t>
+      </w:r>
+      <w:r>
+        <w:t>label</w:t>
+      </w:r>
+      <w:r>
+        <w:t>”</w:t>
+      </w:r>
+      <w:r>
+        <w:t>&gt;Meal Cost&lt;/span&gt;</w:t>
+      </w:r>
+    </w:p>
+    <w:p>
+      <w:r>
+        <w:t>                &lt;span id=</w:t>
+      </w:r>
+      <w:r>
+        <w:t>”</w:t>
+      </w:r>
+      <w:proofErr w:type="spellStart"/>
+      <w:r>
+        <w:t>mealCostDisplay</w:t>
+      </w:r>
+      <w:proofErr w:type="spellEnd"/>
+      <w:r>
+        <w:t>”</w:t>
+      </w:r>
+      <w:r>
+        <w:t xml:space="preserve"> class=</w:t>
+      </w:r>
+      <w:r>
+        <w:t>”</w:t>
+      </w:r>
+      <w:r>
+        <w:t>value</w:t>
+      </w:r>
+      <w:r>
+        <w:t>”</w:t>
+      </w:r>
+      <w:r>
+        <w:t>&gt;$0.00&lt;/span&gt;</w:t>
+      </w:r>
+    </w:p>
+    <w:p>
+      <w:r>
+        <w:t>            &lt;/div&gt;</w:t>
+      </w:r>
+    </w:p>
+    <w:p>
+      <w:r>
+        <w:t>            &lt;div class=</w:t>
+      </w:r>
+      <w:r>
+        <w:t>”</w:t>
+      </w:r>
+      <w:r>
+        <w:t>result-row</w:t>
+      </w:r>
+      <w:r>
+        <w:t>”</w:t>
+      </w:r>
+      <w:r>
+        <w:t>&gt;</w:t>
+      </w:r>
+    </w:p>
+    <w:p>
+      <w:r>
+        <w:t>                &lt;span class=</w:t>
+      </w:r>
+      <w:r>
+        <w:t>”</w:t>
+      </w:r>
+      <w:r>
+        <w:t>label</w:t>
+      </w:r>
+      <w:r>
+        <w:t>”</w:t>
+      </w:r>
+      <w:r>
+        <w:t>&gt;Tip Percent&lt;/span&gt;</w:t>
+      </w:r>
+    </w:p>
+    <w:p>
+      <w:r>
+        <w:t>                &lt;span id=</w:t>
+      </w:r>
+      <w:r>
+        <w:t>”</w:t>
+      </w:r>
+      <w:proofErr w:type="spellStart"/>
+      <w:r>
+        <w:t>tipPercentDisplay</w:t>
+      </w:r>
+      <w:proofErr w:type="spellEnd"/>
+      <w:r>
+        <w:t>”</w:t>
+      </w:r>
+      <w:r>
+        <w:t xml:space="preserve"> class=</w:t>
+      </w:r>
+      <w:r>
+        <w:t>”</w:t>
+      </w:r>
+      <w:r>
+        <w:t>value</w:t>
+      </w:r>
+      <w:r>
+        <w:t>”</w:t>
+      </w:r>
+      <w:r>
+        <w:t>&gt;0%&lt;/span&gt;</w:t>
+      </w:r>
+    </w:p>
+    <w:p>
+      <w:r>
+        <w:t>            &lt;/div&gt;</w:t>
+      </w:r>
+    </w:p>
+    <w:p>
+      <w:r>
+        <w:t>            &lt;div class=</w:t>
+      </w:r>
+      <w:r>
+        <w:t>”</w:t>
+      </w:r>
+      <w:r>
+        <w:t>result-row</w:t>
+      </w:r>
+      <w:r>
+        <w:t>”</w:t>
+      </w:r>
+      <w:r>
+        <w:t>&gt;</w:t>
+      </w:r>
+    </w:p>
+    <w:p>
+      <w:r>
+        <w:t>                &lt;span class=</w:t>
+      </w:r>
+      <w:r>
+        <w:t>”</w:t>
+      </w:r>
+      <w:r>
+        <w:t>label</w:t>
+      </w:r>
+      <w:r>
+        <w:t>”</w:t>
+      </w:r>
+      <w:r>
+        <w:t>&gt;Tip Amount&lt;/span&gt;</w:t>
+      </w:r>
+    </w:p>
+    <w:p>
+      <w:r>
+        <w:t>                &lt;span id=</w:t>
+      </w:r>
+      <w:r>
+        <w:t>”</w:t>
+      </w:r>
+      <w:proofErr w:type="spellStart"/>
+      <w:r>
+        <w:t>tipAmountDisplay</w:t>
+      </w:r>
+      <w:proofErr w:type="spellEnd"/>
+      <w:r>
+        <w:t>”</w:t>
+      </w:r>
+      <w:r>
+        <w:t xml:space="preserve"> class=</w:t>
+      </w:r>
+      <w:r>
+        <w:t>”</w:t>
+      </w:r>
+      <w:r>
+        <w:t>value</w:t>
+      </w:r>
+      <w:r>
+        <w:t>”</w:t>
+      </w:r>
+      <w:r>
+        <w:t>&gt;$0.00&lt;/span&gt;</w:t>
+      </w:r>
+    </w:p>
+    <w:p>
+      <w:r>
+        <w:t>            &lt;/div&gt;</w:t>
+      </w:r>
+    </w:p>
+    <w:p>
+      <w:r>
+        <w:t>            &lt;div class=</w:t>
+      </w:r>
+      <w:r>
+        <w:t>”</w:t>
+      </w:r>
+      <w:r>
+        <w:t>result-row</w:t>
+      </w:r>
+      <w:r>
+        <w:t>”</w:t>
+      </w:r>
+      <w:r>
+        <w:t>&gt;</w:t>
+      </w:r>
+    </w:p>
+    <w:p>
+      <w:r>
+        <w:t>                &lt;span class=</w:t>
+      </w:r>
+      <w:r>
+        <w:t>”</w:t>
+      </w:r>
+      <w:r>
+        <w:t>label</w:t>
+      </w:r>
+      <w:r>
+        <w:t>”</w:t>
+      </w:r>
+      <w:r>
+        <w:t>&gt;Total Cost&lt;/span&gt;</w:t>
+      </w:r>
+    </w:p>
+    <w:p>
+      <w:r>
+        <w:t>                &lt;span id=</w:t>
+      </w:r>
+      <w:r>
+        <w:t>”</w:t>
+      </w:r>
+      <w:proofErr w:type="spellStart"/>
+      <w:r>
+        <w:t>totalCostDisplay</w:t>
+      </w:r>
+      <w:proofErr w:type="spellEnd"/>
+      <w:r>
+        <w:t>”</w:t>
+      </w:r>
+      <w:r>
+        <w:t xml:space="preserve"> class=</w:t>
+      </w:r>
+      <w:r>
+        <w:t>”</w:t>
+      </w:r>
+      <w:r>
+        <w:t>value</w:t>
+      </w:r>
+      <w:r>
+        <w:t>”</w:t>
+      </w:r>
+      <w:r>
+        <w:t>&gt;$0.00&lt;/span&gt;</w:t>
+      </w:r>
+    </w:p>
+    <w:p>
+      <w:r>
+        <w:t>            &lt;/div&gt;</w:t>
+      </w:r>
+    </w:p>
+    <w:p>
+      <w:r>
+        <w:t>        &lt;/section&gt;</w:t>
+      </w:r>
+    </w:p>
+    <w:p>
+      <w:r>
+        <w:t>    &lt;/main&gt;</w:t>
+      </w:r>
+    </w:p>
+    <w:p/>
+    <w:p>
+      <w:r>
+        <w:t xml:space="preserve">    &lt;script </w:t>
+      </w:r>
+      <w:proofErr w:type="spellStart"/>
+      <w:r>
+        <w:t>src</w:t>
+      </w:r>
+      <w:proofErr w:type="spellEnd"/>
       <w:r>
         <w:t>=</w:t>
       </w:r>
       <w:r>
         <w:t>”</w:t>
       </w:r>
-      <w:proofErr w:type="spellStart"/>
-      <w:r>
-        <w:t>mealCost</w:t>
-      </w:r>
-      <w:proofErr w:type="spellEnd"/>
-      <w:proofErr w:type="gramEnd"/>
-      <w:r>
-        <w:t>”</w:t>
-      </w:r>
-      <w:r>
-        <w:t>&gt;Meal Cost&lt;/label&gt;</w:t>
-      </w:r>
-    </w:p>
-    <w:p>
-      <w:r>
-        <w:t>            &lt;input id</w:t>
-      </w:r>
-      <w:proofErr w:type="gramStart"/>
-      <w:r>
-        <w:t>=</w:t>
-      </w:r>
-      <w:r>
-        <w:t>”</w:t>
-      </w:r>
-      <w:proofErr w:type="spellStart"/>
-      <w:r>
-        <w:t>mealCost</w:t>
-      </w:r>
-      <w:proofErr w:type="spellEnd"/>
-      <w:proofErr w:type="gramEnd"/>
-      <w:r>
-        <w:t>”</w:t>
-      </w:r>
-      <w:r>
-        <w:t xml:space="preserve"> type</w:t>
-      </w:r>
-      <w:proofErr w:type="gramStart"/>
-      <w:r>
-        <w:t>=</w:t>
-      </w:r>
-      <w:r>
-        <w:t>”</w:t>
-      </w:r>
-      <w:r>
-        <w:t>number</w:t>
-      </w:r>
-      <w:proofErr w:type="gramEnd"/>
-      <w:r>
-        <w:t>”</w:t>
-      </w:r>
-      <w:r>
-        <w:t xml:space="preserve"> min=</w:t>
-      </w:r>
-      <w:r>
-        <w:t>”</w:t>
-      </w:r>
-      <w:r>
-        <w:t>0</w:t>
-      </w:r>
-      <w:r>
-        <w:t>”</w:t>
-      </w:r>
-      <w:r>
-        <w:t xml:space="preserve"> step=</w:t>
-      </w:r>
-      <w:r>
-        <w:t>”</w:t>
-      </w:r>
-      <w:r>
-        <w:t>0.01</w:t>
-      </w:r>
-      <w:r>
-        <w:t>”</w:t>
-      </w:r>
-      <w:r>
-        <w:t xml:space="preserve"> placeholder</w:t>
-      </w:r>
-      <w:proofErr w:type="gramStart"/>
-      <w:r>
-        <w:t>=</w:t>
-      </w:r>
-      <w:r>
-        <w:t>”</w:t>
-      </w:r>
-      <w:r>
-        <w:t>Enter</w:t>
-      </w:r>
-      <w:proofErr w:type="gramEnd"/>
-      <w:r>
-        <w:t xml:space="preserve"> meal cost</w:t>
-      </w:r>
-      <w:r>
-        <w:t>”</w:t>
-      </w:r>
-      <w:r>
-        <w:t xml:space="preserve"> required&gt;</w:t>
-      </w:r>
-    </w:p>
-    <w:p/>
-    <w:p>
-      <w:r>
-        <w:t>            &lt;label for</w:t>
-      </w:r>
-      <w:proofErr w:type="gramStart"/>
-      <w:r>
-        <w:t>=</w:t>
-      </w:r>
-      <w:r>
-        <w:t>”</w:t>
-      </w:r>
-      <w:proofErr w:type="spellStart"/>
-      <w:r>
-        <w:t>tipPercent</w:t>
-      </w:r>
-      <w:proofErr w:type="spellEnd"/>
-      <w:proofErr w:type="gramEnd"/>
-      <w:r>
-        <w:t>”</w:t>
-      </w:r>
-      <w:r>
-        <w:t>&gt;Tip Percent&lt;/label&gt;</w:t>
-      </w:r>
-    </w:p>
-    <w:p>
-      <w:r>
-        <w:t>            &lt;input id</w:t>
-      </w:r>
-      <w:proofErr w:type="gramStart"/>
-      <w:r>
-        <w:t>=</w:t>
-      </w:r>
-      <w:r>
-        <w:t>”</w:t>
-      </w:r>
-      <w:proofErr w:type="spellStart"/>
-      <w:r>
-        <w:t>tipPercent</w:t>
-      </w:r>
-      <w:proofErr w:type="spellEnd"/>
-      <w:proofErr w:type="gramEnd"/>
-      <w:r>
-        <w:t>”</w:t>
-      </w:r>
-      <w:r>
-        <w:t xml:space="preserve"> type</w:t>
-      </w:r>
-      <w:proofErr w:type="gramStart"/>
-      <w:r>
-        <w:t>=</w:t>
-      </w:r>
-      <w:r>
-        <w:t>”</w:t>
-      </w:r>
-      <w:r>
-        <w:t>number</w:t>
-      </w:r>
-      <w:proofErr w:type="gramEnd"/>
-      <w:r>
-        <w:t>”</w:t>
-      </w:r>
-      <w:r>
-        <w:t xml:space="preserve"> min=</w:t>
-      </w:r>
-      <w:r>
-        <w:t>”</w:t>
-      </w:r>
-      <w:r>
-        <w:t>0</w:t>
-      </w:r>
-      <w:r>
-        <w:t>”</w:t>
-      </w:r>
-      <w:r>
-        <w:t xml:space="preserve"> max=</w:t>
-      </w:r>
-      <w:r>
-        <w:t>”</w:t>
-      </w:r>
-      <w:r>
-        <w:t>100</w:t>
-      </w:r>
-      <w:r>
-        <w:t>”</w:t>
-      </w:r>
-      <w:r>
-        <w:t xml:space="preserve"> step=</w:t>
-      </w:r>
-      <w:r>
-        <w:t>”</w:t>
-      </w:r>
-      <w:r>
-        <w:t>1</w:t>
-      </w:r>
-      <w:r>
-        <w:t>”</w:t>
-      </w:r>
-      <w:r>
-        <w:t xml:space="preserve"> placeholder</w:t>
-      </w:r>
-      <w:proofErr w:type="gramStart"/>
-      <w:r>
-        <w:t>=</w:t>
-      </w:r>
-      <w:r>
-        <w:t>”</w:t>
-      </w:r>
-      <w:r>
-        <w:t>Enter</w:t>
-      </w:r>
-      <w:proofErr w:type="gramEnd"/>
-      <w:r>
-        <w:t xml:space="preserve"> tip percent</w:t>
-      </w:r>
-      <w:r>
-        <w:t>”</w:t>
-      </w:r>
-      <w:r>
-        <w:t xml:space="preserve"> required&gt;</w:t>
-      </w:r>
-    </w:p>
-    <w:p/>
-    <w:p>
-      <w:r>
-        <w:t>            &lt;button id</w:t>
-      </w:r>
-      <w:proofErr w:type="gramStart"/>
-      <w:r>
-        <w:t>=</w:t>
-      </w:r>
-      <w:r>
-        <w:t>”</w:t>
-      </w:r>
-      <w:proofErr w:type="spellStart"/>
-      <w:r>
-        <w:t>calculateBtn</w:t>
-      </w:r>
-      <w:proofErr w:type="spellEnd"/>
-      <w:proofErr w:type="gramEnd"/>
-      <w:r>
-        <w:t>”</w:t>
-      </w:r>
-      <w:r>
-        <w:t xml:space="preserve"> type</w:t>
-      </w:r>
-      <w:proofErr w:type="gramStart"/>
-      <w:r>
-        <w:t>=</w:t>
-      </w:r>
-      <w:r>
-        <w:t>”</w:t>
-      </w:r>
-      <w:r>
-        <w:t>button</w:t>
-      </w:r>
-      <w:proofErr w:type="gramEnd"/>
-      <w:r>
-        <w:t>”</w:t>
-      </w:r>
-      <w:r>
-        <w:t>&gt;Calculate&lt;/button&gt;</w:t>
-      </w:r>
-    </w:p>
-    <w:p>
-      <w:r>
-        <w:t>        &lt;/div&gt;</w:t>
-      </w:r>
-    </w:p>
-    <w:p/>
-    <w:p>
-      <w:r>
-        <w:t>        &lt;section class</w:t>
-      </w:r>
-      <w:proofErr w:type="gramStart"/>
-      <w:r>
-        <w:t>=</w:t>
-      </w:r>
-      <w:r>
-        <w:t>”</w:t>
-      </w:r>
-      <w:r>
-        <w:t>results</w:t>
-      </w:r>
-      <w:proofErr w:type="gramEnd"/>
-      <w:r>
-        <w:t>”</w:t>
-      </w:r>
-      <w:r>
-        <w:t xml:space="preserve"> aria-live</w:t>
-      </w:r>
-      <w:proofErr w:type="gramStart"/>
-      <w:r>
-        <w:t>=</w:t>
-      </w:r>
-      <w:r>
-        <w:t>”</w:t>
-      </w:r>
-      <w:r>
-        <w:t>polite</w:t>
-      </w:r>
-      <w:proofErr w:type="gramEnd"/>
-      <w:r>
-        <w:t>”</w:t>
-      </w:r>
-      <w:r>
-        <w:t>&gt;</w:t>
-      </w:r>
-    </w:p>
-    <w:p>
-      <w:r>
-        <w:t>            &lt;div class</w:t>
-      </w:r>
-      <w:proofErr w:type="gramStart"/>
-      <w:r>
-        <w:t>=</w:t>
-      </w:r>
-      <w:r>
-        <w:t>”</w:t>
-      </w:r>
-      <w:r>
-        <w:t>result</w:t>
-      </w:r>
-      <w:proofErr w:type="gramEnd"/>
-      <w:r>
-        <w:t>-row</w:t>
-      </w:r>
-      <w:r>
-        <w:t>”</w:t>
-      </w:r>
-      <w:r>
-        <w:t>&gt;</w:t>
-      </w:r>
-    </w:p>
-    <w:p>
-      <w:r>
-        <w:t>                &lt;span class</w:t>
-      </w:r>
-      <w:proofErr w:type="gramStart"/>
-      <w:r>
-        <w:t>=</w:t>
-      </w:r>
-      <w:r>
-        <w:t>”</w:t>
-      </w:r>
-      <w:r>
-        <w:t>label</w:t>
-      </w:r>
-      <w:proofErr w:type="gramEnd"/>
-      <w:r>
-        <w:t>”</w:t>
-      </w:r>
-      <w:r>
-        <w:t>&gt;Meal Cost&lt;/span&gt;</w:t>
-      </w:r>
-    </w:p>
-    <w:p>
-      <w:r>
-        <w:t>                &lt;span id</w:t>
-      </w:r>
-      <w:proofErr w:type="gramStart"/>
-      <w:r>
-        <w:t>=</w:t>
-      </w:r>
-      <w:r>
-        <w:t>”</w:t>
-      </w:r>
-      <w:proofErr w:type="spellStart"/>
-      <w:r>
-        <w:t>mealCostDisplay</w:t>
-      </w:r>
-      <w:proofErr w:type="spellEnd"/>
-      <w:proofErr w:type="gramEnd"/>
-      <w:r>
-        <w:t>”</w:t>
-      </w:r>
-      <w:r>
-        <w:t xml:space="preserve"> class=</w:t>
-      </w:r>
-      <w:r>
-        <w:t>”</w:t>
-      </w:r>
-      <w:r>
-        <w:t>value</w:t>
-      </w:r>
-      <w:r>
-        <w:t>”</w:t>
-      </w:r>
-      <w:r>
-        <w:t>&gt;$0.00&lt;/span&gt;</w:t>
-      </w:r>
-    </w:p>
-    <w:p>
-      <w:r>
-        <w:t>            &lt;/div&gt;</w:t>
-      </w:r>
-    </w:p>
-    <w:p>
-      <w:r>
-        <w:t>            &lt;div class</w:t>
-      </w:r>
-      <w:proofErr w:type="gramStart"/>
-      <w:r>
-        <w:t>=</w:t>
-      </w:r>
-      <w:r>
-        <w:t>”</w:t>
-      </w:r>
-      <w:r>
-        <w:t>result</w:t>
-      </w:r>
-      <w:proofErr w:type="gramEnd"/>
-      <w:r>
-        <w:t>-row</w:t>
-      </w:r>
-      <w:r>
-        <w:t>”</w:t>
-      </w:r>
-      <w:r>
-        <w:t>&gt;</w:t>
-      </w:r>
-    </w:p>
-    <w:p>
-      <w:r>
-        <w:t>                &lt;span class</w:t>
-      </w:r>
-      <w:proofErr w:type="gramStart"/>
-      <w:r>
-        <w:t>=</w:t>
-      </w:r>
-      <w:r>
-        <w:t>”</w:t>
-      </w:r>
-      <w:r>
-        <w:t>label</w:t>
-      </w:r>
-      <w:proofErr w:type="gramEnd"/>
-      <w:r>
-        <w:t>”</w:t>
-      </w:r>
-      <w:r>
-        <w:t>&gt;Tip Percent&lt;/span&gt;</w:t>
-      </w:r>
-    </w:p>
-    <w:p>
-      <w:r>
-        <w:t>                &lt;span id</w:t>
-      </w:r>
-      <w:proofErr w:type="gramStart"/>
-      <w:r>
-        <w:t>=</w:t>
-      </w:r>
-      <w:r>
-        <w:t>”</w:t>
-      </w:r>
-      <w:proofErr w:type="spellStart"/>
-      <w:r>
-        <w:t>tipPercentDisplay</w:t>
-      </w:r>
-      <w:proofErr w:type="spellEnd"/>
-      <w:proofErr w:type="gramEnd"/>
-      <w:r>
-        <w:t>”</w:t>
-      </w:r>
-      <w:r>
-        <w:t xml:space="preserve"> class=</w:t>
-      </w:r>
-      <w:r>
-        <w:t>”</w:t>
-      </w:r>
-      <w:r>
-        <w:t>value</w:t>
-      </w:r>
-      <w:r>
-        <w:t>”</w:t>
-      </w:r>
-      <w:r>
-        <w:t>&gt;0%&lt;/span&gt;</w:t>
-      </w:r>
-    </w:p>
-    <w:p>
-      <w:r>
-        <w:t>            &lt;/div&gt;</w:t>
-      </w:r>
-    </w:p>
-    <w:p>
-      <w:r>
-        <w:t>            &lt;div class</w:t>
-      </w:r>
-      <w:proofErr w:type="gramStart"/>
-      <w:r>
-        <w:t>=</w:t>
-      </w:r>
-      <w:r>
-        <w:t>”</w:t>
-      </w:r>
-      <w:r>
-        <w:t>result</w:t>
-      </w:r>
-      <w:proofErr w:type="gramEnd"/>
-      <w:r>
-        <w:t>-row</w:t>
-      </w:r>
-      <w:r>
-        <w:t>”</w:t>
-      </w:r>
-      <w:r>
-        <w:t>&gt;</w:t>
-      </w:r>
-    </w:p>
-    <w:p>
-      <w:r>
-        <w:t>                &lt;span class</w:t>
-      </w:r>
-      <w:proofErr w:type="gramStart"/>
-      <w:r>
-        <w:t>=</w:t>
-      </w:r>
-      <w:r>
-        <w:t>”</w:t>
-      </w:r>
-      <w:r>
-        <w:t>label</w:t>
-      </w:r>
-      <w:proofErr w:type="gramEnd"/>
-      <w:r>
-        <w:t>”</w:t>
-      </w:r>
-      <w:r>
-        <w:t>&gt;Tip Amount&lt;/span&gt;</w:t>
-      </w:r>
-    </w:p>
-    <w:p>
-      <w:r>
-        <w:t>                &lt;span id</w:t>
-      </w:r>
-      <w:proofErr w:type="gramStart"/>
-      <w:r>
-        <w:t>=</w:t>
-      </w:r>
-      <w:r>
-        <w:t>”</w:t>
-      </w:r>
-      <w:proofErr w:type="spellStart"/>
-      <w:r>
-        <w:t>tipAmountDisplay</w:t>
-      </w:r>
-      <w:proofErr w:type="spellEnd"/>
-      <w:proofErr w:type="gramEnd"/>
-      <w:r>
-        <w:t>”</w:t>
-      </w:r>
-      <w:r>
-        <w:t xml:space="preserve"> class=</w:t>
-      </w:r>
-      <w:r>
-        <w:t>”</w:t>
-      </w:r>
-      <w:r>
-        <w:t>value</w:t>
-      </w:r>
-      <w:r>
-        <w:t>”</w:t>
-      </w:r>
-      <w:r>
-        <w:t>&gt;$0.00&lt;/span&gt;</w:t>
-      </w:r>
-    </w:p>
-    <w:p>
-      <w:r>
-        <w:t>            &lt;/div&gt;</w:t>
-      </w:r>
-    </w:p>
-    <w:p>
-      <w:r>
-        <w:t>            &lt;div class</w:t>
-      </w:r>
-      <w:proofErr w:type="gramStart"/>
-      <w:r>
-        <w:t>=</w:t>
-      </w:r>
-      <w:r>
-        <w:t>”</w:t>
-      </w:r>
-      <w:r>
-        <w:t>result</w:t>
-      </w:r>
-      <w:proofErr w:type="gramEnd"/>
-      <w:r>
-        <w:t>-row</w:t>
-      </w:r>
-      <w:r>
-        <w:t>”</w:t>
-      </w:r>
-      <w:r>
-        <w:t>&gt;</w:t>
-      </w:r>
-    </w:p>
-    <w:p>
-      <w:r>
-        <w:t>                &lt;span class</w:t>
-      </w:r>
-      <w:proofErr w:type="gramStart"/>
-      <w:r>
-        <w:t>=</w:t>
-      </w:r>
-      <w:r>
-        <w:t>”</w:t>
-      </w:r>
-      <w:r>
-        <w:t>label</w:t>
-      </w:r>
-      <w:proofErr w:type="gramEnd"/>
-      <w:r>
-        <w:t>”</w:t>
-      </w:r>
-      <w:r>
-        <w:t>&gt;Total Cost&lt;/span&gt;</w:t>
-      </w:r>
-    </w:p>
-    <w:p>
-      <w:r>
-        <w:t>                &lt;span id</w:t>
-      </w:r>
-      <w:proofErr w:type="gramStart"/>
-      <w:r>
-        <w:t>=</w:t>
-      </w:r>
-      <w:r>
-        <w:t>”</w:t>
-      </w:r>
-      <w:proofErr w:type="spellStart"/>
-      <w:r>
-        <w:t>totalCostDisplay</w:t>
-      </w:r>
-      <w:proofErr w:type="spellEnd"/>
-      <w:proofErr w:type="gramEnd"/>
-      <w:r>
-        <w:t>”</w:t>
-      </w:r>
-      <w:r>
-        <w:t xml:space="preserve"> class=</w:t>
-      </w:r>
-      <w:r>
-        <w:t>”</w:t>
-      </w:r>
-      <w:r>
-        <w:t>value</w:t>
-      </w:r>
-      <w:r>
-        <w:t>”</w:t>
-      </w:r>
-      <w:r>
-        <w:t>&gt;$0.00&lt;/span&gt;</w:t>
-      </w:r>
-    </w:p>
-    <w:p>
-      <w:r>
-        <w:t>            &lt;/div&gt;</w:t>
-      </w:r>
-    </w:p>
-    <w:p>
-      <w:r>
-        <w:t>        &lt;/section&gt;</w:t>
-      </w:r>
-    </w:p>
-    <w:p>
-      <w:r>
-        <w:t>    &lt;/main&gt;</w:t>
-      </w:r>
-    </w:p>
-    <w:p/>
-    <w:p>
-      <w:r>
-        <w:t xml:space="preserve">    &lt;script </w:t>
-      </w:r>
-      <w:proofErr w:type="spellStart"/>
-      <w:r>
-        <w:t>src</w:t>
-      </w:r>
-      <w:proofErr w:type="spellEnd"/>
-      <w:proofErr w:type="gramStart"/>
-      <w:r>
-        <w:t>=</w:t>
-      </w:r>
-      <w:r>
-        <w:t>”</w:t>
-      </w:r>
       <w:r>
         <w:t>script.js</w:t>
       </w:r>
-      <w:proofErr w:type="gramEnd"/>
       <w:r>
         <w:t>”</w:t>
       </w:r>
@@ -1067,28 +927,12 @@
     </w:p>
     <w:p>
       <w:r>
-        <w:t xml:space="preserve">    </w:t>
-      </w:r>
-      <w:proofErr w:type="gramStart"/>
-      <w:r>
-        <w:t>background: #</w:t>
-      </w:r>
-      <w:proofErr w:type="gramEnd"/>
-      <w:r>
-        <w:t>f3f6fb;</w:t>
-      </w:r>
-    </w:p>
-    <w:p>
-      <w:r>
-        <w:t xml:space="preserve">    </w:t>
-      </w:r>
-      <w:proofErr w:type="gramStart"/>
-      <w:r>
-        <w:t>color: #</w:t>
-      </w:r>
-      <w:proofErr w:type="gramEnd"/>
-      <w:r>
-        <w:t>1f2937;</w:t>
+        <w:t>    background: #f3f6fb;</w:t>
+      </w:r>
+    </w:p>
+    <w:p>
+      <w:r>
+        <w:t>    color: #1f2937;</w:t>
       </w:r>
     </w:p>
     <w:p>
@@ -1103,39 +947,18 @@
     </w:p>
     <w:p/>
     <w:p>
-      <w:proofErr w:type="gramStart"/>
-      <w:r>
-        <w:t>.calculator</w:t>
-      </w:r>
-      <w:proofErr w:type="gramEnd"/>
-      <w:r>
-        <w:t xml:space="preserve"> {</w:t>
-      </w:r>
-    </w:p>
-    <w:p>
-      <w:r>
-        <w:t xml:space="preserve">    width: </w:t>
-      </w:r>
-      <w:proofErr w:type="gramStart"/>
-      <w:r>
-        <w:t>min(</w:t>
-      </w:r>
-      <w:proofErr w:type="gramEnd"/>
-      <w:r>
-        <w:t>100%, 420px);</w:t>
-      </w:r>
-    </w:p>
-    <w:p>
-      <w:r>
-        <w:t xml:space="preserve">    </w:t>
-      </w:r>
-      <w:proofErr w:type="gramStart"/>
-      <w:r>
-        <w:t>background: #</w:t>
-      </w:r>
-      <w:proofErr w:type="gramEnd"/>
-      <w:r>
-        <w:t>ffffff;</w:t>
+      <w:r>
+        <w:t>.calculator {</w:t>
+      </w:r>
+    </w:p>
+    <w:p>
+      <w:r>
+        <w:t>    width: min(100%, 420px);</w:t>
+      </w:r>
+    </w:p>
+    <w:p>
+      <w:r>
+        <w:t>    background: #ffffff;</w:t>
       </w:r>
     </w:p>
     <w:p>
@@ -1153,17 +976,12 @@
         <w:t xml:space="preserve">    box-shadow: 0 10px 30px </w:t>
       </w:r>
       <w:proofErr w:type="spellStart"/>
-      <w:proofErr w:type="gramStart"/>
       <w:r>
         <w:t>rgba</w:t>
       </w:r>
       <w:proofErr w:type="spellEnd"/>
       <w:r>
-        <w:t>(</w:t>
-      </w:r>
-      <w:proofErr w:type="gramEnd"/>
-      <w:r>
-        <w:t>15, 23, 42, 0.12);</w:t>
+        <w:t>(15, 23, 42, 0.12);</w:t>
       </w:r>
     </w:p>
     <w:p>
@@ -1184,28 +1002,12 @@
     </w:p>
     <w:p>
       <w:r>
-        <w:t>    text-</w:t>
-      </w:r>
-      <w:proofErr w:type="gramStart"/>
-      <w:r>
-        <w:t>align:</w:t>
-      </w:r>
-      <w:proofErr w:type="gramEnd"/>
-      <w:r>
-        <w:t xml:space="preserve"> center;</w:t>
-      </w:r>
-    </w:p>
-    <w:p>
-      <w:r>
-        <w:t xml:space="preserve">    </w:t>
-      </w:r>
-      <w:proofErr w:type="gramStart"/>
-      <w:r>
-        <w:t>color: #</w:t>
-      </w:r>
-      <w:proofErr w:type="gramEnd"/>
-      <w:r>
-        <w:t>2563eb;</w:t>
+        <w:t>    text-align: center;</w:t>
+      </w:r>
+    </w:p>
+    <w:p>
+      <w:r>
+        <w:t>    color: #2563eb;</w:t>
       </w:r>
     </w:p>
     <w:p>
@@ -1216,13 +1018,8 @@
     </w:p>
     <w:p/>
     <w:p>
-      <w:proofErr w:type="gramStart"/>
-      <w:r>
-        <w:t>.inputs</w:t>
-      </w:r>
-      <w:proofErr w:type="gramEnd"/>
-      <w:r>
-        <w:t xml:space="preserve"> {</w:t>
+      <w:r>
+        <w:t>.inputs {</w:t>
       </w:r>
     </w:p>
     <w:p>
@@ -1258,15 +1055,7 @@
     </w:p>
     <w:p>
       <w:r>
-        <w:t xml:space="preserve">    </w:t>
-      </w:r>
-      <w:proofErr w:type="gramStart"/>
-      <w:r>
-        <w:t>color: #</w:t>
-      </w:r>
-      <w:proofErr w:type="gramEnd"/>
-      <w:r>
-        <w:t>374151;</w:t>
+        <w:t>    color: #374151;</w:t>
       </w:r>
     </w:p>
     <w:p>
@@ -1349,28 +1138,12 @@
     </w:p>
     <w:p>
       <w:r>
-        <w:t xml:space="preserve">    </w:t>
-      </w:r>
-      <w:proofErr w:type="gramStart"/>
-      <w:r>
-        <w:t>color: #</w:t>
-      </w:r>
-      <w:proofErr w:type="gramEnd"/>
-      <w:r>
-        <w:t>ffffff;</w:t>
-      </w:r>
-    </w:p>
-    <w:p>
-      <w:r>
-        <w:t xml:space="preserve">    </w:t>
-      </w:r>
-      <w:proofErr w:type="gramStart"/>
-      <w:r>
-        <w:t>background: #</w:t>
-      </w:r>
-      <w:proofErr w:type="gramEnd"/>
-      <w:r>
-        <w:t>2563eb;</w:t>
+        <w:t>    color: #ffffff;</w:t>
+      </w:r>
+    </w:p>
+    <w:p>
+      <w:r>
+        <w:t>    background: #2563eb;</w:t>
       </w:r>
     </w:p>
     <w:p>
@@ -1381,27 +1154,17 @@
     <w:p/>
     <w:p>
       <w:proofErr w:type="spellStart"/>
-      <w:proofErr w:type="gramStart"/>
       <w:r>
         <w:t>button:hover</w:t>
       </w:r>
       <w:proofErr w:type="spellEnd"/>
-      <w:proofErr w:type="gramEnd"/>
       <w:r>
         <w:t xml:space="preserve"> {</w:t>
       </w:r>
     </w:p>
     <w:p>
       <w:r>
-        <w:t xml:space="preserve">    </w:t>
-      </w:r>
-      <w:proofErr w:type="gramStart"/>
-      <w:r>
-        <w:t>background: #</w:t>
-      </w:r>
-      <w:proofErr w:type="gramEnd"/>
-      <w:r>
-        <w:t>1d4ed8;</w:t>
+        <w:t>    background: #1d4ed8;</w:t>
       </w:r>
     </w:p>
     <w:p>
@@ -1411,43 +1174,98 @@
     </w:p>
     <w:p/>
     <w:p>
-      <w:proofErr w:type="gramStart"/>
-      <w:r>
-        <w:t>.results</w:t>
-      </w:r>
-      <w:proofErr w:type="gramEnd"/>
+      <w:r>
+        <w:t>.results {</w:t>
+      </w:r>
+    </w:p>
+    <w:p>
+      <w:r>
+        <w:t>    margin-top: 20px;</w:t>
+      </w:r>
+    </w:p>
+    <w:p>
+      <w:r>
+        <w:t>    border-top: 1px solid #e5e7eb;</w:t>
+      </w:r>
+    </w:p>
+    <w:p>
+      <w:r>
+        <w:t>    padding-top: 16px;</w:t>
+      </w:r>
+    </w:p>
+    <w:p>
+      <w:r>
+        <w:t>    display: flex;</w:t>
+      </w:r>
+    </w:p>
+    <w:p>
+      <w:r>
+        <w:t>    flex-direction: column;</w:t>
+      </w:r>
+    </w:p>
+    <w:p>
+      <w:r>
+        <w:t>    gap: 10px;</w:t>
+      </w:r>
+    </w:p>
+    <w:p>
+      <w:r>
+        <w:t>}</w:t>
+      </w:r>
+    </w:p>
+    <w:p/>
+    <w:p>
+      <w:r>
+        <w:t>.result-row {</w:t>
+      </w:r>
+    </w:p>
+    <w:p>
+      <w:r>
+        <w:t>    display: flex;</w:t>
+      </w:r>
+    </w:p>
+    <w:p>
+      <w:r>
+        <w:t>    justify-content: space-between;</w:t>
+      </w:r>
+    </w:p>
+    <w:p>
+      <w:r>
+        <w:t>    align-items: center;</w:t>
+      </w:r>
+    </w:p>
+    <w:p>
+      <w:r>
+        <w:t>    padding-bottom: 8px;</w:t>
+      </w:r>
+    </w:p>
+    <w:p>
+      <w:r>
+        <w:t>    border-bottom: 1px dashed #e5e7eb;</w:t>
+      </w:r>
+    </w:p>
+    <w:p>
+      <w:r>
+        <w:t>}</w:t>
+      </w:r>
+    </w:p>
+    <w:p/>
+    <w:p>
+      <w:r>
+        <w:t>.</w:t>
+      </w:r>
+      <w:proofErr w:type="spellStart"/>
+      <w:r>
+        <w:t>result-row:last-child</w:t>
+      </w:r>
+      <w:proofErr w:type="spellEnd"/>
       <w:r>
         <w:t xml:space="preserve"> {</w:t>
       </w:r>
     </w:p>
     <w:p>
       <w:r>
-        <w:t>    margin-top: 20px;</w:t>
-      </w:r>
-    </w:p>
-    <w:p>
-      <w:r>
-        <w:t>    border-top: 1px solid #e5e7eb;</w:t>
-      </w:r>
-    </w:p>
-    <w:p>
-      <w:r>
-        <w:t>    padding-top: 16px;</w:t>
-      </w:r>
-    </w:p>
-    <w:p>
-      <w:r>
-        <w:t>    display: flex;</w:t>
-      </w:r>
-    </w:p>
-    <w:p>
-      <w:r>
-        <w:t>    flex-direction: column;</w:t>
-      </w:r>
-    </w:p>
-    <w:p>
-      <w:r>
-        <w:t>    gap: 10px;</w:t>
+        <w:t>    border-bottom: none;</w:t>
       </w:r>
     </w:p>
     <w:p>
@@ -1457,38 +1275,18 @@
     </w:p>
     <w:p/>
     <w:p>
-      <w:proofErr w:type="gramStart"/>
-      <w:r>
-        <w:t>.result</w:t>
-      </w:r>
-      <w:proofErr w:type="gramEnd"/>
-      <w:r>
-        <w:t>-row {</w:t>
-      </w:r>
-    </w:p>
-    <w:p>
-      <w:r>
-        <w:t>    display: flex;</w:t>
-      </w:r>
-    </w:p>
-    <w:p>
-      <w:r>
-        <w:t>    justify-content: space-between;</w:t>
-      </w:r>
-    </w:p>
-    <w:p>
-      <w:r>
-        <w:t>    align-items: center;</w:t>
-      </w:r>
-    </w:p>
-    <w:p>
-      <w:r>
-        <w:t>    padding-bottom: 8px;</w:t>
-      </w:r>
-    </w:p>
-    <w:p>
-      <w:r>
-        <w:t>    border-bottom: 1px dashed #e5e7eb;</w:t>
+      <w:r>
+        <w:t>.label {</w:t>
+      </w:r>
+    </w:p>
+    <w:p>
+      <w:r>
+        <w:t>    font-weight: 600;</w:t>
+      </w:r>
+    </w:p>
+    <w:p>
+      <w:r>
+        <w:t>    color: #4b5563;</w:t>
       </w:r>
     </w:p>
     <w:p>
@@ -1498,77 +1296,6 @@
     </w:p>
     <w:p/>
     <w:p>
-      <w:proofErr w:type="gramStart"/>
-      <w:r>
-        <w:t>.</w:t>
-      </w:r>
-      <w:proofErr w:type="spellStart"/>
-      <w:r>
-        <w:t>result</w:t>
-      </w:r>
-      <w:proofErr w:type="gramEnd"/>
-      <w:r>
-        <w:t>-</w:t>
-      </w:r>
-      <w:proofErr w:type="gramStart"/>
-      <w:r>
-        <w:t>row:last</w:t>
-      </w:r>
-      <w:proofErr w:type="gramEnd"/>
-      <w:r>
-        <w:t>-child</w:t>
-      </w:r>
-      <w:proofErr w:type="spellEnd"/>
-      <w:r>
-        <w:t xml:space="preserve"> {</w:t>
-      </w:r>
-    </w:p>
-    <w:p>
-      <w:r>
-        <w:t>    border-bottom: none;</w:t>
-      </w:r>
-    </w:p>
-    <w:p>
-      <w:r>
-        <w:t>}</w:t>
-      </w:r>
-    </w:p>
-    <w:p/>
-    <w:p>
-      <w:proofErr w:type="gramStart"/>
-      <w:r>
-        <w:t>.label</w:t>
-      </w:r>
-      <w:proofErr w:type="gramEnd"/>
-      <w:r>
-        <w:t xml:space="preserve"> {</w:t>
-      </w:r>
-    </w:p>
-    <w:p>
-      <w:r>
-        <w:t>    font-weight: 600;</w:t>
-      </w:r>
-    </w:p>
-    <w:p>
-      <w:r>
-        <w:t xml:space="preserve">    </w:t>
-      </w:r>
-      <w:proofErr w:type="gramStart"/>
-      <w:r>
-        <w:t>color: #</w:t>
-      </w:r>
-      <w:proofErr w:type="gramEnd"/>
-      <w:r>
-        <w:t>4b5563;</w:t>
-      </w:r>
-    </w:p>
-    <w:p>
-      <w:r>
-        <w:t>}</w:t>
-      </w:r>
-    </w:p>
-    <w:p/>
-    <w:p>
       <w:r>
         <w:t>.value {</w:t>
       </w:r>
@@ -1580,15 +1307,7 @@
     </w:p>
     <w:p>
       <w:r>
-        <w:t xml:space="preserve">    </w:t>
-      </w:r>
-      <w:proofErr w:type="gramStart"/>
-      <w:r>
-        <w:t>color: #</w:t>
-      </w:r>
-      <w:proofErr w:type="gramEnd"/>
-      <w:r>
-        <w:t>111827;</w:t>
+        <w:t>    color: #111827;</w:t>
       </w:r>
     </w:p>
     <w:p>
@@ -1640,12 +1359,10 @@
         <w:t xml:space="preserve"> = </w:t>
       </w:r>
       <w:proofErr w:type="spellStart"/>
-      <w:proofErr w:type="gramStart"/>
       <w:r>
         <w:t>document.getElementById</w:t>
       </w:r>
       <w:proofErr w:type="spellEnd"/>
-      <w:proofErr w:type="gramEnd"/>
       <w:r>
         <w:t>("</w:t>
       </w:r>
@@ -1671,12 +1388,10 @@
         <w:t xml:space="preserve"> = </w:t>
       </w:r>
       <w:proofErr w:type="spellStart"/>
-      <w:proofErr w:type="gramStart"/>
       <w:r>
         <w:t>document.getElementById</w:t>
       </w:r>
       <w:proofErr w:type="spellEnd"/>
-      <w:proofErr w:type="gramEnd"/>
       <w:r>
         <w:t>("</w:t>
       </w:r>
@@ -1702,12 +1417,10 @@
         <w:t xml:space="preserve"> = </w:t>
       </w:r>
       <w:proofErr w:type="spellStart"/>
-      <w:proofErr w:type="gramStart"/>
       <w:r>
         <w:t>document.getElementById</w:t>
       </w:r>
       <w:proofErr w:type="spellEnd"/>
-      <w:proofErr w:type="gramEnd"/>
       <w:r>
         <w:t>("</w:t>
       </w:r>
@@ -1733,12 +1446,10 @@
         <w:t xml:space="preserve"> = </w:t>
       </w:r>
       <w:proofErr w:type="spellStart"/>
-      <w:proofErr w:type="gramStart"/>
       <w:r>
         <w:t>document.getElementById</w:t>
       </w:r>
       <w:proofErr w:type="spellEnd"/>
-      <w:proofErr w:type="gramEnd"/>
       <w:r>
         <w:t>("</w:t>
       </w:r>
@@ -1764,12 +1475,10 @@
         <w:t xml:space="preserve"> = </w:t>
       </w:r>
       <w:proofErr w:type="spellStart"/>
-      <w:proofErr w:type="gramStart"/>
       <w:r>
         <w:t>document.getElementById</w:t>
       </w:r>
       <w:proofErr w:type="spellEnd"/>
-      <w:proofErr w:type="gramEnd"/>
       <w:r>
         <w:t>("</w:t>
       </w:r>
@@ -1795,12 +1504,10 @@
         <w:t xml:space="preserve"> = </w:t>
       </w:r>
       <w:proofErr w:type="spellStart"/>
-      <w:proofErr w:type="gramStart"/>
       <w:r>
         <w:t>document.getElementById</w:t>
       </w:r>
       <w:proofErr w:type="spellEnd"/>
-      <w:proofErr w:type="gramEnd"/>
       <w:r>
         <w:t>("</w:t>
       </w:r>
@@ -1826,12 +1533,10 @@
         <w:t xml:space="preserve"> = </w:t>
       </w:r>
       <w:proofErr w:type="spellStart"/>
-      <w:proofErr w:type="gramStart"/>
       <w:r>
         <w:t>document.getElementById</w:t>
       </w:r>
       <w:proofErr w:type="spellEnd"/>
-      <w:proofErr w:type="gramEnd"/>
       <w:r>
         <w:t>("</w:t>
       </w:r>
@@ -1855,13 +1560,8 @@
       </w:r>
       <w:proofErr w:type="spellEnd"/>
       <w:r>
-        <w:t>(</w:t>
-      </w:r>
-      <w:proofErr w:type="gramStart"/>
-      <w:r>
-        <w:t>value) {</w:t>
-      </w:r>
-      <w:proofErr w:type="gramEnd"/>
+        <w:t>(value) {</w:t>
+      </w:r>
     </w:p>
     <w:p>
       <w:r>
@@ -1869,22 +1569,12 @@
         <w:t>    return `$${</w:t>
       </w:r>
       <w:proofErr w:type="spellStart"/>
-      <w:proofErr w:type="gramStart"/>
       <w:r>
         <w:t>value.toFixed</w:t>
       </w:r>
       <w:proofErr w:type="spellEnd"/>
-      <w:proofErr w:type="gramEnd"/>
-      <w:r>
-        <w:t>(2</w:t>
-      </w:r>
-      <w:proofErr w:type="gramStart"/>
-      <w:r>
-        <w:t>)}`</w:t>
-      </w:r>
-      <w:proofErr w:type="gramEnd"/>
-      <w:r>
-        <w:t>;</w:t>
+      <w:r>
+        <w:t>(2)}`;</w:t>
       </w:r>
     </w:p>
     <w:p>
@@ -1903,35 +1593,20 @@
       </w:r>
       <w:proofErr w:type="spellEnd"/>
       <w:r>
-        <w:t>(</w:t>
-      </w:r>
-      <w:proofErr w:type="gramStart"/>
-      <w:r>
-        <w:t>value) {</w:t>
-      </w:r>
-      <w:proofErr w:type="gramEnd"/>
+        <w:t>(value) {</w:t>
+      </w:r>
     </w:p>
     <w:p>
       <w:r>
         <w:t>    return `${</w:t>
       </w:r>
       <w:proofErr w:type="spellStart"/>
-      <w:proofErr w:type="gramStart"/>
       <w:r>
         <w:t>value.toFixed</w:t>
       </w:r>
       <w:proofErr w:type="spellEnd"/>
-      <w:proofErr w:type="gramEnd"/>
-      <w:r>
-        <w:t>(0</w:t>
-      </w:r>
-      <w:proofErr w:type="gramStart"/>
-      <w:r>
-        <w:t>)}%</w:t>
-      </w:r>
-      <w:proofErr w:type="gramEnd"/>
-      <w:r>
-        <w:t>`;</w:t>
+      <w:r>
+        <w:t>(0)}%`;</w:t>
       </w:r>
     </w:p>
     <w:p>
@@ -1945,107 +1620,77 @@
         <w:t xml:space="preserve">function </w:t>
       </w:r>
       <w:proofErr w:type="spellStart"/>
-      <w:proofErr w:type="gramStart"/>
       <w:r>
         <w:t>calculateTip</w:t>
       </w:r>
       <w:proofErr w:type="spellEnd"/>
       <w:r>
-        <w:t>(</w:t>
-      </w:r>
-      <w:proofErr w:type="gramEnd"/>
+        <w:t>() {</w:t>
+      </w:r>
+    </w:p>
+    <w:p>
+      <w:r>
+        <w:t xml:space="preserve">    const </w:t>
+      </w:r>
+      <w:proofErr w:type="spellStart"/>
+      <w:r>
+        <w:t>mealCost</w:t>
+      </w:r>
+      <w:proofErr w:type="spellEnd"/>
+      <w:r>
+        <w:t xml:space="preserve"> = Number(</w:t>
+      </w:r>
+      <w:proofErr w:type="spellStart"/>
+      <w:r>
+        <w:t>mealCostInput.value</w:t>
+      </w:r>
+      <w:proofErr w:type="spellEnd"/>
+      <w:r>
+        <w:t>);</w:t>
+      </w:r>
+    </w:p>
+    <w:p>
+      <w:r>
+        <w:t xml:space="preserve">    const </w:t>
+      </w:r>
+      <w:proofErr w:type="spellStart"/>
+      <w:r>
+        <w:t>tipPercent</w:t>
+      </w:r>
+      <w:proofErr w:type="spellEnd"/>
+      <w:r>
+        <w:t xml:space="preserve"> = Number(</w:t>
+      </w:r>
+      <w:proofErr w:type="spellStart"/>
+      <w:r>
+        <w:t>tipPercentInput.value</w:t>
+      </w:r>
+      <w:proofErr w:type="spellEnd"/>
+      <w:r>
+        <w:t>);</w:t>
+      </w:r>
+    </w:p>
+    <w:p/>
+    <w:p>
+      <w:r>
+        <w:t>    if (!</w:t>
+      </w:r>
+      <w:proofErr w:type="spellStart"/>
+      <w:r>
+        <w:t>mealCostInput.value</w:t>
+      </w:r>
+      <w:proofErr w:type="spellEnd"/>
+      <w:r>
+        <w:t xml:space="preserve"> || !</w:t>
+      </w:r>
+      <w:proofErr w:type="spellStart"/>
+      <w:r>
+        <w:t>tipPercentInput.value</w:t>
+      </w:r>
+      <w:proofErr w:type="spellEnd"/>
       <w:r>
         <w:t>) {</w:t>
       </w:r>
-    </w:p>
-    <w:p>
-      <w:r>
-        <w:t xml:space="preserve">    const </w:t>
-      </w:r>
-      <w:proofErr w:type="spellStart"/>
-      <w:r>
-        <w:t>mealCost</w:t>
-      </w:r>
-      <w:proofErr w:type="spellEnd"/>
-      <w:r>
-        <w:t xml:space="preserve"> = </w:t>
-      </w:r>
-      <w:proofErr w:type="gramStart"/>
-      <w:r>
-        <w:t>Number(</w:t>
-      </w:r>
-      <w:proofErr w:type="spellStart"/>
-      <w:proofErr w:type="gramEnd"/>
-      <w:r>
-        <w:t>mealCostInput.value</w:t>
-      </w:r>
-      <w:proofErr w:type="spellEnd"/>
-      <w:r>
-        <w:t>);</w:t>
-      </w:r>
-    </w:p>
-    <w:p>
-      <w:r>
-        <w:t xml:space="preserve">    const </w:t>
-      </w:r>
-      <w:proofErr w:type="spellStart"/>
-      <w:r>
-        <w:t>tipPercent</w:t>
-      </w:r>
-      <w:proofErr w:type="spellEnd"/>
-      <w:r>
-        <w:t xml:space="preserve"> = </w:t>
-      </w:r>
-      <w:proofErr w:type="gramStart"/>
-      <w:r>
-        <w:t>Number(</w:t>
-      </w:r>
-      <w:proofErr w:type="spellStart"/>
-      <w:proofErr w:type="gramEnd"/>
-      <w:r>
-        <w:t>tipPercentInput.value</w:t>
-      </w:r>
-      <w:proofErr w:type="spellEnd"/>
-      <w:r>
-        <w:t>);</w:t>
-      </w:r>
-    </w:p>
-    <w:p/>
-    <w:p>
-      <w:r>
-        <w:t xml:space="preserve">    if </w:t>
-      </w:r>
-      <w:proofErr w:type="gramStart"/>
-      <w:r>
-        <w:t>(!</w:t>
-      </w:r>
-      <w:proofErr w:type="spellStart"/>
-      <w:r>
-        <w:t>mealCostInput.value</w:t>
-      </w:r>
-      <w:proofErr w:type="spellEnd"/>
-      <w:proofErr w:type="gramEnd"/>
-      <w:r>
-        <w:t xml:space="preserve"> |</w:t>
-      </w:r>
-      <w:proofErr w:type="gramStart"/>
-      <w:r>
-        <w:t>| !</w:t>
-      </w:r>
-      <w:proofErr w:type="spellStart"/>
-      <w:proofErr w:type="gramEnd"/>
-      <w:r>
-        <w:t>tipPercentInput.</w:t>
-      </w:r>
-      <w:proofErr w:type="gramStart"/>
-      <w:r>
-        <w:t>value</w:t>
-      </w:r>
-      <w:proofErr w:type="spellEnd"/>
-      <w:r>
-        <w:t>) {</w:t>
-      </w:r>
-      <w:proofErr w:type="gramEnd"/>
     </w:p>
     <w:p>
       <w:r>
@@ -2452,7 +2097,6 @@
         <w:t>tipPercentInput</w:t>
       </w:r>
       <w:proofErr w:type="spellEnd"/>
-      <w:proofErr w:type="gramStart"/>
       <w:r>
         <w:t>].</w:t>
       </w:r>
@@ -2461,7 +2105,6 @@
         <w:t>forEach</w:t>
       </w:r>
       <w:proofErr w:type="spellEnd"/>
-      <w:proofErr w:type="gramEnd"/>
       <w:r>
         <w:t>((input) =&gt; {</w:t>
       </w:r>
@@ -2471,12 +2114,10 @@
         <w:t xml:space="preserve">    </w:t>
       </w:r>
       <w:proofErr w:type="spellStart"/>
-      <w:proofErr w:type="gramStart"/>
       <w:r>
         <w:t>input.addEventListener</w:t>
       </w:r>
       <w:proofErr w:type="spellEnd"/>
-      <w:proofErr w:type="gramEnd"/>
       <w:r>
         <w:t>("</w:t>
       </w:r>
@@ -2499,25 +2140,18 @@
       </w:r>
       <w:proofErr w:type="spellEnd"/>
       <w:r>
-        <w:t xml:space="preserve"> === "Enter</w:t>
-      </w:r>
-      <w:proofErr w:type="gramStart"/>
-      <w:r>
-        <w:t>") {</w:t>
-      </w:r>
-      <w:proofErr w:type="gramEnd"/>
+        <w:t xml:space="preserve"> === "Enter") {</w:t>
+      </w:r>
     </w:p>
     <w:p>
       <w:r>
         <w:t xml:space="preserve">            </w:t>
       </w:r>
       <w:proofErr w:type="spellStart"/>
-      <w:proofErr w:type="gramStart"/>
       <w:r>
         <w:t>event.preventDefault</w:t>
       </w:r>
       <w:proofErr w:type="spellEnd"/>
-      <w:proofErr w:type="gramEnd"/>
       <w:r>
         <w:t>();</w:t>
       </w:r>
@@ -2527,85 +2161,75 @@
         <w:t xml:space="preserve">            </w:t>
       </w:r>
       <w:proofErr w:type="spellStart"/>
-      <w:proofErr w:type="gramStart"/>
       <w:r>
         <w:t>calculateTip</w:t>
       </w:r>
       <w:proofErr w:type="spellEnd"/>
       <w:r>
-        <w:t>(</w:t>
-      </w:r>
-      <w:proofErr w:type="gramEnd"/>
+        <w:t>();</w:t>
+      </w:r>
+    </w:p>
+    <w:p>
+      <w:r>
+        <w:t>        }</w:t>
+      </w:r>
+    </w:p>
+    <w:p>
+      <w:r>
+        <w:t>    });</w:t>
+      </w:r>
+    </w:p>
+    <w:p>
+      <w:r>
+        <w:t>});</w:t>
+      </w:r>
+    </w:p>
+    <w:p/>
+    <w:p>
+      <w:proofErr w:type="spellStart"/>
+      <w:r>
+        <w:t>mealCostInput.addEventListener</w:t>
+      </w:r>
+      <w:proofErr w:type="spellEnd"/>
+      <w:r>
+        <w:t xml:space="preserve">("input", </w:t>
+      </w:r>
+      <w:proofErr w:type="spellStart"/>
+      <w:r>
+        <w:t>calculateTip</w:t>
+      </w:r>
+      <w:proofErr w:type="spellEnd"/>
       <w:r>
         <w:t>);</w:t>
       </w:r>
     </w:p>
     <w:p>
-      <w:r>
-        <w:t>        }</w:t>
-      </w:r>
-    </w:p>
-    <w:p>
-      <w:r>
-        <w:t>    });</w:t>
-      </w:r>
-    </w:p>
-    <w:p>
-      <w:r>
-        <w:t>});</w:t>
+      <w:proofErr w:type="spellStart"/>
+      <w:r>
+        <w:t>tipPercentInput.addEventListener</w:t>
+      </w:r>
+      <w:proofErr w:type="spellEnd"/>
+      <w:r>
+        <w:t xml:space="preserve">("input", </w:t>
+      </w:r>
+      <w:proofErr w:type="spellStart"/>
+      <w:r>
+        <w:t>calculateTip</w:t>
+      </w:r>
+      <w:proofErr w:type="spellEnd"/>
+      <w:r>
+        <w:t>);</w:t>
       </w:r>
     </w:p>
     <w:p/>
     <w:p>
       <w:proofErr w:type="spellStart"/>
       <w:r>
-        <w:t>mealCostInput.addEventListener</w:t>
-      </w:r>
-      <w:proofErr w:type="spellEnd"/>
-      <w:r>
-        <w:t xml:space="preserve">("input", </w:t>
-      </w:r>
-      <w:proofErr w:type="spellStart"/>
-      <w:r>
         <w:t>calculateTip</w:t>
       </w:r>
       <w:proofErr w:type="spellEnd"/>
       <w:r>
-        <w:t>);</w:t>
-      </w:r>
-    </w:p>
-    <w:p>
-      <w:proofErr w:type="spellStart"/>
-      <w:r>
-        <w:t>tipPercentInput.addEventListener</w:t>
-      </w:r>
-      <w:proofErr w:type="spellEnd"/>
-      <w:r>
-        <w:t xml:space="preserve">("input", </w:t>
-      </w:r>
-      <w:proofErr w:type="spellStart"/>
-      <w:r>
-        <w:t>calculateTip</w:t>
-      </w:r>
-      <w:proofErr w:type="spellEnd"/>
-      <w:r>
-        <w:t>);</w:t>
-      </w:r>
-    </w:p>
-    <w:p/>
-    <w:p>
-      <w:proofErr w:type="spellStart"/>
-      <w:proofErr w:type="gramStart"/>
-      <w:r>
-        <w:t>calculateTip</w:t>
-      </w:r>
-      <w:proofErr w:type="spellEnd"/>
-      <w:r>
-        <w:t>(</w:t>
-      </w:r>
-      <w:proofErr w:type="gramEnd"/>
-      <w:r>
-        <w:t>);</w:t>
+        <w:t>();</w:t>
       </w:r>
     </w:p>
     <w:p/>
@@ -2635,6 +2259,7 @@
         <w:rPr>
           <w:b/>
           <w:bCs/>
+          <w:noProof/>
         </w:rPr>
         <w:drawing>
           <wp:inline distT="0" distB="0" distL="0" distR="0" wp14:anchorId="43515A74" wp14:editId="5F632706">
@@ -2684,6 +2309,7 @@
         <w:rPr>
           <w:b/>
           <w:bCs/>
+          <w:noProof/>
         </w:rPr>
         <w:lastRenderedPageBreak/>
         <w:drawing>
@@ -2730,6 +2356,54 @@
           <w:bCs/>
         </w:rPr>
       </w:pPr>
+      <w:proofErr w:type="spellStart"/>
+      <w:r>
+        <w:rPr>
+          <w:b/>
+          <w:bCs/>
+        </w:rPr>
+        <w:t>Github</w:t>
+      </w:r>
+      <w:proofErr w:type="spellEnd"/>
+    </w:p>
+    <w:p>
+      <w:r>
+        <w:drawing>
+          <wp:inline distT="0" distB="0" distL="0" distR="0" wp14:anchorId="1CFA4B41" wp14:editId="43A7F23E">
+            <wp:extent cx="5943600" cy="1643380"/>
+            <wp:effectExtent l="0" t="0" r="0" b="0"/>
+            <wp:docPr id="564866220" name="Picture 1"/>
+            <wp:cNvGraphicFramePr>
+              <a:graphicFrameLocks xmlns:a="http://schemas.openxmlformats.org/drawingml/2006/main" noChangeAspect="1"/>
+            </wp:cNvGraphicFramePr>
+            <a:graphic xmlns:a="http://schemas.openxmlformats.org/drawingml/2006/main">
+              <a:graphicData uri="http://schemas.openxmlformats.org/drawingml/2006/picture">
+                <pic:pic xmlns:pic="http://schemas.openxmlformats.org/drawingml/2006/picture">
+                  <pic:nvPicPr>
+                    <pic:cNvPr id="564866220" name=""/>
+                    <pic:cNvPicPr/>
+                  </pic:nvPicPr>
+                  <pic:blipFill>
+                    <a:blip r:embed="rId6"/>
+                    <a:stretch>
+                      <a:fillRect/>
+                    </a:stretch>
+                  </pic:blipFill>
+                  <pic:spPr>
+                    <a:xfrm>
+                      <a:off x="0" y="0"/>
+                      <a:ext cx="5943600" cy="1643380"/>
+                    </a:xfrm>
+                    <a:prstGeom prst="rect">
+                      <a:avLst/>
+                    </a:prstGeom>
+                  </pic:spPr>
+                </pic:pic>
+              </a:graphicData>
+            </a:graphic>
+          </wp:inline>
+        </w:drawing>
+      </w:r>
     </w:p>
     <w:sectPr>
       <w:pgSz w:w="12240" w:h="15840"/>
@@ -3344,6 +3018,7 @@
   <w:style w:type="character" w:default="1" w:styleId="DefaultParagraphFont">
     <w:name w:val="Default Paragraph Font"/>
     <w:uiPriority w:val="1"/>
+    <w:semiHidden/>
     <w:unhideWhenUsed/>
   </w:style>
   <w:style w:type="table" w:default="1" w:styleId="TableNormal">

</xml_diff>